<commit_message>
feat: add clause 7.5 on electronic document exchange (EDO)
</commit_message>
<xml_diff>
--- a/templates/contract.docx
+++ b/templates/contract.docx
@@ -3780,6 +3780,42 @@
           <w:spacing w:val="-8"/>
         </w:rPr>
         <w:t>Договор, соглашения к нему, акты, счета, заявки, уведомления и иные документы Сторон могут направляться друг другу для обмена письмами, курьером и электронными документами, передаваемыми посредством электронной почты, указанной в реквизитах настоящего Договора. Направленные электронные документы в виде подписанных Сторонами скан-копий являются надлежаще оформленными и имеют юридическую силу.</w:t>
+      </w:r>
+    </w:p>
+    <w:p>
+      <w:pPr>
+        <w:tabs>
+          <w:tab w:val="num" w:pos="0"/>
+        </w:tabs>
+        <w:ind w:firstLine="851"/>
+        <w:contextualSpacing/>
+        <w:jc w:val="both"/>
+        <w:rPr>
+          <w:color w:val="000000"/>
+          <w:spacing w:val="-8"/>
+        </w:rPr>
+      </w:pPr>
+      <w:r>
+        <w:rPr>
+          <w:color w:val="000000"/>
+          <w:spacing w:val="-8"/>
+        </w:rPr>
+        <w:t>7.5.</w:t>
+      </w:r>
+      <w:r>
+        <w:rPr>
+          <w:b/>
+          <w:color w:val="000000"/>
+          <w:spacing w:val="-8"/>
+        </w:rPr>
+        <w:tab/>
+      </w:r>
+      <w:r>
+        <w:rPr>
+          <w:color w:val="000000"/>
+          <w:spacing w:val="-8"/>
+        </w:rPr>
+        <w:t>Стороны вправе осуществлять обмен документами по Договору (в том числе поручениями, актами оказанных услуг, счетами, дополнительными соглашениями) в форме электронных документов посредством системы электронного документооборота (ЭДО) через операторов ЭДО, обеспечивающих обмен юридически значимыми электронными документами. Документы, подписанные усиленной квалифицированной электронной подписью уполномоченного лица Стороны и переданные через оператора ЭДО, признаются равнозначными документам на бумажном носителе, подписанным собственноручной подписью, и влекут для Сторон соответствующие права и обязанности. Порядок и условия обмена документами посредством ЭДО (в том числе реквизиты оператора ЭДО и идентификаторы участников электронного документооборота) согласовываются Сторонами дополнительно.</w:t>
       </w:r>
     </w:p>
     <w:p>

</xml_diff>

<commit_message>
feat: add clauses 2.2.11, 2.3.4.1, 3.4.1, updated 6.5, 6.5.1 (ELS/EDO)
</commit_message>
<xml_diff>
--- a/templates/contract.docx
+++ b/templates/contract.docx
@@ -1345,6 +1345,77 @@
       <w:pPr>
         <w:tabs>
           <w:tab w:val="num" w:pos="0"/>
+          <w:tab w:val="left" w:pos="851"/>
+        </w:tabs>
+        <w:ind w:firstLine="851"/>
+        <w:contextualSpacing/>
+        <w:jc w:val="both"/>
+        <w:rPr>
+          <w:color w:val="000000"/>
+          <w:spacing w:val="-8"/>
+        </w:rPr>
+      </w:pPr>
+      <w:r>
+        <w:rPr>
+          <w:color w:val="000000"/>
+          <w:spacing w:val="-8"/>
+        </w:rPr>
+        <w:t xml:space="preserve">2.2.11</w:t>
+      </w:r>
+      <w:r>
+        <w:rPr>
+          <w:color w:val="000000"/>
+          <w:spacing w:val="-8"/>
+        </w:rPr>
+        <w:tab/>
+      </w:r>
+      <w:r>
+        <w:rPr>
+          <w:color w:val="000000"/>
+          <w:spacing w:val="-8"/>
+        </w:rPr>
+        <w:t>приостановить совершение таможенных операций либо отказаться от подачи декларации на товары до момента подтверждения наличия денежных средств на Едином лицевом счете, с которого будут уплачиваться таможенные платежи, в размере, предусмотренном п. 2.3.4.1 настоящего Договора. При этом сроки оказания услуг автоматически продлеваются на период устранения Клиентом указанных обстоятельств, а Представитель не несет ответственности за нарушение сроков таможенного оформления.</w:t>
+      </w:r>
+    </w:p>
+    <w:p>
+      <w:pPr>
+        <w:tabs>
+          <w:tab w:val="num" w:pos="0"/>
+        </w:tabs>
+        <w:ind w:firstLine="1200"/>
+        <w:contextualSpacing/>
+        <w:jc w:val="both"/>
+        <w:rPr>
+          <w:color w:val="000000"/>
+          <w:spacing w:val="-8"/>
+        </w:rPr>
+      </w:pPr>
+      <w:r>
+        <w:rPr>
+          <w:color w:val="000000"/>
+          <w:spacing w:val="-8"/>
+        </w:rPr>
+        <w:t xml:space="preserve">2.3.4.1.</w:t>
+      </w:r>
+      <w:r>
+        <w:rPr>
+          <w:color w:val="000000"/>
+          <w:spacing w:val="-8"/>
+        </w:rPr>
+        <w:tab/>
+      </w:r>
+      <w:r>
+        <w:rPr>
+          <w:color w:val="000000"/>
+          <w:spacing w:val="-8"/>
+        </w:rPr>
+        <w:t>Клиент обязан до подачи декларации на товары обеспечить наличие денежных средств на Едином лицевом счете, с которого будут уплачиваться таможенные платежи, в размере предварительно рассчитанной Представителем суммы таможенных платежей, увеличенной на 30 (тридцать) процентов. Указанный резерв предназначен для покрытия возможного изменения курса иностранной валюты, корректировки таможенной стоимости, изменения размера таможенных пошлин, налогов, таможенных сборов и иных обстоятельств, влияющих на размер подлежащих уплате таможенных платежей.</w:t>
+      </w:r>
+    </w:p>
+    <w:p>
+      <w:pPr>
+        <w:tabs>
+          <w:tab w:val="num" w:pos="0"/>
         </w:tabs>
         <w:ind w:firstLine="851"/>
         <w:contextualSpacing/>
@@ -2431,6 +2502,41 @@
         <w:t>3.4.</w:t>
         <w:tab/>
         <w:t>По усмотрению Клиента в поручении могут быть предусмотрены: желаемый срок исполнения поручения, указания об уплате Представителем таможенных платежей за счет собственных средств или поручительстве перед таможенными органами РФ за исполнение обязательств по уплате таможенных платежей Клиентом, если в соответствии с Таможенным кодексом ЕАЭС и законодательством РФ требуется обеспечение их уплаты, а также иные особенности оказания Услуг. Представитель самостоятельно определяет, какие конкретно таможенные операции необходимо совершить для помещения товаров Клиента под таможенную процедуру, с учетом положений таможенного законодательства ЕАЭС и законодательства Российской Федерации о таможенном регулировании, а также устанавливает ориентировочные сроки оказания Услуг.</w:t>
+      </w:r>
+    </w:p>
+    <w:p>
+      <w:pPr>
+        <w:tabs>
+          <w:tab w:val="num" w:pos="0"/>
+        </w:tabs>
+        <w:ind w:firstLine="1200"/>
+        <w:contextualSpacing/>
+        <w:jc w:val="both"/>
+        <w:rPr>
+          <w:color w:val="000000"/>
+          <w:spacing w:val="-8"/>
+        </w:rPr>
+      </w:pPr>
+      <w:r>
+        <w:rPr>
+          <w:color w:val="000000"/>
+          <w:spacing w:val="-8"/>
+        </w:rPr>
+        <w:t xml:space="preserve">3.4.1.</w:t>
+      </w:r>
+      <w:r>
+        <w:rPr>
+          <w:color w:val="000000"/>
+          <w:spacing w:val="-8"/>
+        </w:rPr>
+        <w:tab/>
+      </w:r>
+      <w:r>
+        <w:rPr>
+          <w:color w:val="000000"/>
+          <w:spacing w:val="-8"/>
+        </w:rPr>
+        <w:t>Расчет суммы таможенных платежей, предоставляемый Представителем, является предварительным и осуществляется на основании сведений, имеющихся на момент расчета. Представитель не гарантирует неизменность размера таможенных платежей, поскольку их окончательный размер определяется в соответствии с законодательством Евразийского экономического союза и Российской Федерации исходя из курса иностранной валюты, ставок таможенных пошлин, налогов, таможенных сборов и иных показателей, действующих на дату исчисления и уплаты таможенных платежей.</w:t>
       </w:r>
     </w:p>
     <w:p>
@@ -3383,24 +3489,82 @@
         <w:t>.</w:t>
       </w:r>
     </w:p>
-    <w:p>
-      <w:pPr>
-        <w:tabs>
-          <w:tab w:val="num" w:pos="0"/>
-        </w:tabs>
-        <w:contextualSpacing/>
-        <w:jc w:val="both"/>
-        <w:rPr>
-          <w:color w:val="000000"/>
-          <w:spacing w:val="-8"/>
-        </w:rPr>
-      </w:pPr>
-      <w:r>
-        <w:rPr>
-          <w:color w:val="000000"/>
-          <w:spacing w:val="-8"/>
-        </w:rPr>
-        <w:t xml:space="preserve">                 6.5.   В случае отказа в выпуске декларации таможенным органом, услуга по декларированию считается оказанной. Стороны договорились, что в случае если декларация не выпущена по причине отсутствия у Клиента денежных средств на ЕЛС и/ или запрашиваемых представителем документов и информации, то при повторной подаче декларации Представитель выставляет счет на оплату услуг, где стоимость декларирования товаров таможенным представителем согласно гл. 55 ТК ЕАЭС (основной лист) составляет 25% от стоимости декларирования товаров, а Клиент оплачивает его в срок, указанный в счете на оплату.</w:t>
+    <w:p w14:paraId="D4E5F6G7">
+      <w:pPr>
+        <w:tabs>
+          <w:tab w:val="num" w:pos="0"/>
+        </w:tabs>
+        <w:contextualSpacing/>
+        <w:jc w:val="both"/>
+        <w:rPr>
+          <w:color w:val="000000"/>
+          <w:spacing w:val="-8"/>
+        </w:rPr>
+      </w:pPr>
+      <w:r>
+        <w:rPr>
+          <w:color w:val="000000"/>
+          <w:spacing w:val="-8"/>
+        </w:rPr>
+        <w:t xml:space="preserve">6.5.   </w:t>
+      </w:r>
+      <w:r>
+        <w:rPr>
+          <w:color w:val="000000"/>
+          <w:spacing w:val="-8"/>
+        </w:rPr>
+        <w:t>В случае отсутствия либо недостаточности денежных средств на Едином лицевом счете для уплаты таможенных платежей и (или) непредставления Клиентом необходимых документов и сведений Представитель вправе приостановить совершение таможенных операций либо подачу декларации до устранения указанных обстоятельств.</w:t>
+      </w:r>
+      <w:r>
+        <w:rPr>
+          <w:color w:val="000000"/>
+          <w:spacing w:val="-8"/>
+        </w:rPr>
+        <w:br/>
+        <w:t>При отказе таможенного органа в выпуске товаров по указанным причинам услуга по декларированию считается оказанной. При повторной подаче декларации Представитель вправе выставить Клиенту счет за повторное декларирование в размере 25% от стоимости услуги по декларированию товаров согласно действующим тарифам Представителя.</w:t>
+      </w:r>
+      <w:r>
+        <w:rPr>
+          <w:color w:val="000000"/>
+          <w:spacing w:val="-8"/>
+        </w:rPr>
+        <w:br/>
+        <w:t>Представитель не несет ответственности за задержку выпуска товаров, расходы по хранению, простой транспорта, пени и иные убытки Клиента, возникшие вследствие указанных обстоятельств.</w:t>
+      </w:r>
+    </w:p>
+    <w:p w14:paraId="E5F6G7H8">
+      <w:pPr>
+        <w:tabs>
+          <w:tab w:val="num" w:pos="0"/>
+        </w:tabs>
+        <w:ind w:firstLine="851"/>
+        <w:contextualSpacing/>
+        <w:jc w:val="both"/>
+        <w:rPr>
+          <w:color w:val="000000"/>
+          <w:spacing w:val="-8"/>
+        </w:rPr>
+      </w:pPr>
+      <w:r>
+        <w:rPr>
+          <w:color w:val="000000"/>
+          <w:spacing w:val="-8"/>
+        </w:rPr>
+        <w:t xml:space="preserve">6.5.1.</w:t>
+      </w:r>
+      <w:r>
+        <w:rPr>
+          <w:color w:val="000000"/>
+          <w:spacing w:val="-8"/>
+        </w:rPr>
+        <w:tab/>
+      </w:r>
+      <w:r>
+        <w:rPr>
+          <w:color w:val="000000"/>
+          <w:spacing w:val="-8"/>
+        </w:rPr>
+        <w:t>Клиент подтверждает, что ему известно о возможности изменения курса иностранной валюты, ставок таможенных пошлин, налогов, размера таможенных сборов, а также иных показателей, влияющих на размер таможенных платежей. Риск недостаточности денежных средств и все связанные с этим последствия, включая задержку выпуска товаров, расходы по хранению товаров на складе временного хранения, простой транспортных средств, начисление пеней и иные убытки, несет Клиент.</w:t>
       </w:r>
     </w:p>
     <w:p>

</xml_diff>

<commit_message>
fix: move clause 2.3.4.1 to correct position after 2.3.4
</commit_message>
<xml_diff>
--- a/templates/contract.docx
+++ b/templates/contract.docx
@@ -1382,41 +1382,6 @@
         <w:tabs>
           <w:tab w:val="num" w:pos="0"/>
         </w:tabs>
-        <w:ind w:firstLine="1200"/>
-        <w:contextualSpacing/>
-        <w:jc w:val="both"/>
-        <w:rPr>
-          <w:color w:val="000000"/>
-          <w:spacing w:val="-8"/>
-        </w:rPr>
-      </w:pPr>
-      <w:r>
-        <w:rPr>
-          <w:color w:val="000000"/>
-          <w:spacing w:val="-8"/>
-        </w:rPr>
-        <w:t xml:space="preserve">2.3.4.1.</w:t>
-      </w:r>
-      <w:r>
-        <w:rPr>
-          <w:color w:val="000000"/>
-          <w:spacing w:val="-8"/>
-        </w:rPr>
-        <w:tab/>
-      </w:r>
-      <w:r>
-        <w:rPr>
-          <w:color w:val="000000"/>
-          <w:spacing w:val="-8"/>
-        </w:rPr>
-        <w:t>Клиент обязан до подачи декларации на товары обеспечить наличие денежных средств на Едином лицевом счете, с которого будут уплачиваться таможенные платежи, в размере предварительно рассчитанной Представителем суммы таможенных платежей, увеличенной на 30 (тридцать) процентов. Указанный резерв предназначен для покрытия возможного изменения курса иностранной валюты, корректировки таможенной стоимости, изменения размера таможенных пошлин, налогов, таможенных сборов и иных обстоятельств, влияющих на размер подлежащих уплате таможенных платежей.</w:t>
-      </w:r>
-    </w:p>
-    <w:p>
-      <w:pPr>
-        <w:tabs>
-          <w:tab w:val="num" w:pos="0"/>
-        </w:tabs>
         <w:ind w:firstLine="851"/>
         <w:contextualSpacing/>
         <w:jc w:val="both"/>
@@ -1529,6 +1494,41 @@
         <w:t xml:space="preserve">по согласованию с Представителем производить расчет и уплату таможенных платежей в отношении декларируемых Представителем товаров либо осуществлять обеспечение уплаты указанных платежей и представлять Представителю копии документов, подтверждающих исполнение Клиентом обязанности по обеспечению уплаты таможенных платежей, а также платежных и иных банковских документов, заверенных штампом обслуживающего банка </w:t>
         <w:lastRenderedPageBreak/>
         <w:t>Клиента, если иное не предусмотрено в поручении. При необходимости предъявления документов, предусмотренных в настоящем пункте Договора, для проведения таможенных операций и таможенного контроля по запросу Представителя Клиент обязан предоставить оригиналы вышеуказанных документов;</w:t>
+      </w:r>
+    </w:p>
+    <w:p>
+      <w:pPr>
+        <w:tabs>
+          <w:tab w:val="num" w:pos="0"/>
+        </w:tabs>
+        <w:ind w:firstLine="1200"/>
+        <w:contextualSpacing/>
+        <w:jc w:val="both"/>
+        <w:rPr>
+          <w:color w:val="000000"/>
+          <w:spacing w:val="-8"/>
+        </w:rPr>
+      </w:pPr>
+      <w:r>
+        <w:rPr>
+          <w:color w:val="000000"/>
+          <w:spacing w:val="-8"/>
+        </w:rPr>
+        <w:t xml:space="preserve">2.3.4.1.</w:t>
+      </w:r>
+      <w:r>
+        <w:rPr>
+          <w:color w:val="000000"/>
+          <w:spacing w:val="-8"/>
+        </w:rPr>
+        <w:tab/>
+      </w:r>
+      <w:r>
+        <w:rPr>
+          <w:color w:val="000000"/>
+          <w:spacing w:val="-8"/>
+        </w:rPr>
+        <w:t>Клиент обязан до подачи декларации на товары обеспечить наличие денежных средств на Едином лицевом счете, с которого будут уплачиваться таможенные платежи, в размере предварительно рассчитанной Представителем суммы таможенных платежей, увеличенной на 30 (тридцать) процентов. Указанный резерв предназначен для покрытия возможного изменения курса иностранной валюты, корректировки таможенной стоимости, изменения размера таможенных пошлин, налогов, таможенных сборов и иных обстоятельств, влияющих на размер подлежащих уплате таможенных платежей.</w:t>
       </w:r>
     </w:p>
     <w:p>

</xml_diff>